<commit_message>
Organize submission as browsable files with directory guides
Signed-off-by: KaisennHu <74917084+KaisennHu@users.noreply.github.com>
</commit_message>
<xml_diff>
--- a/submissions/kaisennhu/02_算法方案/解题方案与验证报告.docx
+++ b/submissions/kaisennhu/02_算法方案/解题方案与验证报告.docx
@@ -2375,7 +2375,7 @@
     </w:p>
     <w:p>
       <w:r>
-        <w:t>阅读和解压可以使用 Windows。源码构建和测试使用 Linux 或 WSL，依赖 C++17 编译器、make、Python 3.10或更高版本；运行策略不需要 GPU、网络或第三方 Python 包。随包另提供 Linux x86_64 静态可执行程序及 SHA256，可跳过编译运行单条输入。</w:t>
+        <w:t>文档可在 GitHub 在线阅读，也可下载到 Windows 阅读。源码构建和测试使用 Linux 或 WSL，依赖 C++17 编译器、make、Python 3.10或更高版本；运行策略不需要 GPU、网络或第三方 Python 包。随包另提供 Linux x86_64 静态可执行程序及 SHA256，可跳过编译运行单条输入。</w:t>
       </w:r>
     </w:p>
     <w:p>
@@ -2945,7 +2945,7 @@
     </w:p>
     <w:p>
       <w:r>
-        <w:t>可执行程序对应随包唯一源码，放在03_程序/bin/linux-x86_64。ZIP 使用普通 DOS 文件属性，不依赖 Unix 解压权限；预编译入口校验哈希后，仅为包内程序恢复用户执行权限。Windows 原生不能直接运行 Linux ELF，请在 WSL 内运行。</w:t>
+        <w:t>可执行程序对应唯一策略源码，放在03_程序/bin/linux-x86_64。完整克隆仓库后即可运行；预编译入口校验哈希并恢复程序的用户执行权限。Windows 原生不能直接运行 Linux ELF，请在 WSL 内运行。</w:t>
       </w:r>
     </w:p>
     <w:p>

</xml_diff>